<commit_message>
Mejora CV (perfil calzado al aviso, competencias por area) y agrega carta de presentacion
</commit_message>
<xml_diff>
--- a/CV_Tecnico_Electronico.docx
+++ b/CV_Tecnico_Electronico.docx
@@ -10,7 +10,7 @@
         <w:rPr>
           <w:b/>
           <w:color w:val="1F4E79"/>
-          <w:sz w:val="44"/>
+          <w:sz w:val="48"/>
         </w:rPr>
         <w:t>[NOMBRE Y APELLIDO]</w:t>
       </w:r>
@@ -22,9 +22,9 @@
       <w:r>
         <w:rPr>
           <w:color w:val="595959"/>
-          <w:sz w:val="24"/>
+          <w:sz w:val="22"/>
         </w:rPr>
-        <w:t>Técnico Electrónico  |  Perfil Junior</w:t>
+        <w:t>Tecnico Electronico  |  Instalacion y mantenimiento de sistemas electronicos e informatica</w:t>
       </w:r>
     </w:p>
     <w:p>
@@ -36,7 +36,7 @@
           <w:color w:val="595959"/>
           <w:sz w:val="20"/>
         </w:rPr>
-        <w:t>[Teléfono]  •  [Email]  •  [Ciudad/Barrio, CABA]  •  [LinkedIn opcional]</w:t>
+        <w:t>[Telefono]   |   [Email]   |   [Barrio], CABA   |   24 anos</w:t>
       </w:r>
     </w:p>
     <w:p>
@@ -61,7 +61,7 @@
           <w:color w:val="000000"/>
           <w:sz w:val="21"/>
         </w:rPr>
-        <w:t>Técnico electrónico con formación en la E.T. N.º 1 “Otto Krause”, con sólida base en electrónica, redes y reparación de equipos. Persona responsable, proactiva y con fuerte vocación de aprendizaje continuo. Busco mi primera experiencia formal como Técnico de Campo en videovigilancia, control de acceso e informática, donde poder aplicar y seguir desarrollando mis conocimientos. [Ajustá este texto a tu estilo.]</w:t>
+        <w:t>Tecnico Electronico egresado de la E.T. N.º 1 “Otto Krause”, con base solida en electronica, redes e informatica. Busco desarrollarme como Tecnico de Campo en instalacion y mantenimiento de sistemas de videovigilancia, control de acceso e informatica general. Me destaco por mi responsabilidad, predisposicion al trabajo en equipo y una fuerte vocacion de aprendizaje continuo: estoy abierto a capacitarme y a sumar tareas en todas las areas. Disponibilidad horaria completa y movilidad para trabajar en clientes dentro de CABA.</w:t>
       </w:r>
     </w:p>
     <w:p>
@@ -77,45 +77,55 @@
           <w:color w:val="1F4E79"/>
           <w:sz w:val="24"/>
         </w:rPr>
-        <w:t>FORMACIÓN ACADÉMICA</w:t>
+        <w:t>POR QUE ENCAJO EN EL PUESTO</w:t>
       </w:r>
     </w:p>
     <w:p>
+      <w:pPr>
+        <w:pStyle w:val="ListBullet"/>
+      </w:pPr>
       <w:r>
         <w:rPr>
           <w:rFonts w:ascii="Calibri" w:hAnsi="Calibri"/>
-          <w:b/>
           <w:sz w:val="21"/>
         </w:rPr>
-        <w:t xml:space="preserve">Título: </w:t>
+        <w:t>Tecnico graduado: cumplo el requisito de titulo (plan completo, todas las materias aprobadas).</w:t>
       </w:r>
+    </w:p>
+    <w:p>
+      <w:pPr>
+        <w:pStyle w:val="ListBullet"/>
+      </w:pPr>
       <w:r>
         <w:rPr>
           <w:rFonts w:ascii="Calibri" w:hAnsi="Calibri"/>
-          <w:i/>
-          <w:color w:val="595959"/>
           <w:sz w:val="21"/>
         </w:rPr>
-        <w:t>Técnico Electrónico — E.T. N.º 1 “Otto Krause” (indicá AÑO de egreso / o “Título en trámite”)</w:t>
+        <w:t>Perfil junior con muchas ganas de aprender; valoro la capacitacion que ofrece la empresa.</w:t>
       </w:r>
     </w:p>
     <w:p>
+      <w:pPr>
+        <w:pStyle w:val="ListBullet"/>
+      </w:pPr>
       <w:r>
         <w:rPr>
           <w:rFonts w:ascii="Calibri" w:hAnsi="Calibri"/>
-          <w:b/>
           <w:sz w:val="21"/>
         </w:rPr>
-        <w:t xml:space="preserve">Estado: </w:t>
+        <w:t>Formacion tecnica orientada a las tres areas de la empresa: electronica, seguridad e informatica.</w:t>
       </w:r>
+    </w:p>
+    <w:p>
+      <w:pPr>
+        <w:pStyle w:val="ListBullet"/>
+      </w:pPr>
       <w:r>
         <w:rPr>
           <w:rFonts w:ascii="Calibri" w:hAnsi="Calibri"/>
-          <w:i/>
-          <w:color w:val="595959"/>
           <w:sz w:val="21"/>
         </w:rPr>
-        <w:t>Egresado — plan de estudios completo, todas las materias aprobadas. Título en trámite.</w:t>
+        <w:t>Disponibilidad para tareas de campo y para desempenarme en todas las areas.</w:t>
       </w:r>
     </w:p>
     <w:p>
@@ -131,23 +141,52 @@
           <w:color w:val="1F4E79"/>
           <w:sz w:val="24"/>
         </w:rPr>
-        <w:t>CURSOS Y CAPACITACIONES (SUGERIDOS PARA SUMAR RÁPIDO)</w:t>
+        <w:t>FORMACION ACADEMICA</w:t>
       </w:r>
     </w:p>
     <w:p>
       <w:r>
         <w:rPr>
-          <w:i/>
-          <w:color w:val="595959"/>
-          <w:sz w:val="20"/>
+          <w:rFonts w:ascii="Calibri" w:hAnsi="Calibri"/>
+          <w:b/>
+          <w:sz w:val="21"/>
         </w:rPr>
-        <w:t>Cursos cortos y gratuitos/accesibles que te hacen más competitivo en pocas semanas. Hacelos y agregalos acá con la fecha real:</w:t>
+        <w:t xml:space="preserve">Titulo: </w:t>
+      </w:r>
+      <w:r>
+        <w:rPr>
+          <w:rFonts w:ascii="Calibri" w:hAnsi="Calibri"/>
+          <w:sz w:val="21"/>
+        </w:rPr>
+        <w:t>Tecnico Electronico — E.T. N.º 1 “Otto Krause”, CABA.</w:t>
       </w:r>
     </w:p>
     <w:p>
-      <w:pPr>
-        <w:pStyle w:val="ListBullet"/>
-      </w:pPr>
+      <w:r>
+        <w:rPr>
+          <w:rFonts w:ascii="Calibri" w:hAnsi="Calibri"/>
+          <w:b/>
+          <w:sz w:val="21"/>
+        </w:rPr>
+        <w:t xml:space="preserve">Estado: </w:t>
+      </w:r>
+      <w:r>
+        <w:rPr>
+          <w:rFonts w:ascii="Calibri" w:hAnsi="Calibri"/>
+          <w:sz w:val="21"/>
+        </w:rPr>
+        <w:t>Egresado — plan de estudios completo, todas las materias aprobadas. Titulo en tramite (disponible certificado analitico / constancia de titulo en tramite).</w:t>
+      </w:r>
+    </w:p>
+    <w:p>
+      <w:r>
+        <w:rPr>
+          <w:rFonts w:ascii="Calibri" w:hAnsi="Calibri"/>
+          <w:b/>
+          <w:sz w:val="21"/>
+        </w:rPr>
+        <w:t xml:space="preserve">Ano de egreso: </w:t>
+      </w:r>
       <w:r>
         <w:rPr>
           <w:rFonts w:ascii="Calibri" w:hAnsi="Calibri"/>
@@ -155,77 +194,7 @@
           <w:color w:val="595959"/>
           <w:sz w:val="21"/>
         </w:rPr>
-        <w:t>Redes / Cableado estructurado — Cisco “Networking Basics” (Networking Academy, online y gratis)</w:t>
-      </w:r>
-    </w:p>
-    <w:p>
-      <w:pPr>
-        <w:pStyle w:val="ListBullet"/>
-      </w:pPr>
-      <w:r>
-        <w:rPr>
-          <w:rFonts w:ascii="Calibri" w:hAnsi="Calibri"/>
-          <w:i/>
-          <w:color w:val="595959"/>
-          <w:sz w:val="21"/>
-        </w:rPr>
-        <w:t>Introducción a la Ciberseguridad — Cisco / Fundación Telefónica</w:t>
-      </w:r>
-    </w:p>
-    <w:p>
-      <w:pPr>
-        <w:pStyle w:val="ListBullet"/>
-      </w:pPr>
-      <w:r>
-        <w:rPr>
-          <w:rFonts w:ascii="Calibri" w:hAnsi="Calibri"/>
-          <w:i/>
-          <w:color w:val="595959"/>
-          <w:sz w:val="21"/>
-        </w:rPr>
-        <w:t>Reparación y armado de PC — cursos en YouTube/EducaciónIT/CoderHouse</w:t>
-      </w:r>
-    </w:p>
-    <w:p>
-      <w:pPr>
-        <w:pStyle w:val="ListBullet"/>
-      </w:pPr>
-      <w:r>
-        <w:rPr>
-          <w:rFonts w:ascii="Calibri" w:hAnsi="Calibri"/>
-          <w:i/>
-          <w:color w:val="595959"/>
-          <w:sz w:val="21"/>
-        </w:rPr>
-        <w:t>CCTV / Videovigilancia IP — capacitaciones de fabricantes (Hikvision, Dahua — academias online gratuitas)</w:t>
-      </w:r>
-    </w:p>
-    <w:p>
-      <w:pPr>
-        <w:pStyle w:val="ListBullet"/>
-      </w:pPr>
-      <w:r>
-        <w:rPr>
-          <w:rFonts w:ascii="Calibri" w:hAnsi="Calibri"/>
-          <w:i/>
-          <w:color w:val="595959"/>
-          <w:sz w:val="21"/>
-        </w:rPr>
-        <w:t>Control de acceso y sistemas de alarmas — cursos básicos del rubro</w:t>
-      </w:r>
-    </w:p>
-    <w:p>
-      <w:pPr>
-        <w:pStyle w:val="ListBullet"/>
-      </w:pPr>
-      <w:r>
-        <w:rPr>
-          <w:rFonts w:ascii="Calibri" w:hAnsi="Calibri"/>
-          <w:i/>
-          <w:color w:val="595959"/>
-          <w:sz w:val="21"/>
-        </w:rPr>
-        <w:t>Excel / Ofimática básica — Fundación Telefónica (gratis)</w:t>
+        <w:t>[completar ano]</w:t>
       </w:r>
     </w:p>
     <w:p>
@@ -241,7 +210,16 @@
           <w:color w:val="1F4E79"/>
           <w:sz w:val="24"/>
         </w:rPr>
-        <w:t>CONOCIMIENTOS TÉCNICOS</w:t>
+        <w:t>COMPETENCIAS TECNICAS</w:t>
+      </w:r>
+    </w:p>
+    <w:p>
+      <w:r>
+        <w:rPr>
+          <w:b/>
+          <w:sz w:val="21"/>
+        </w:rPr>
+        <w:t>Videovigilancia y seguridad electronica</w:t>
       </w:r>
     </w:p>
     <w:p>
@@ -253,7 +231,7 @@
           <w:rFonts w:ascii="Calibri" w:hAnsi="Calibri"/>
           <w:sz w:val="21"/>
         </w:rPr>
-        <w:t>Electrónica analógica y digital, uso de instrumental (multímetro, osciloscopio).</w:t>
+        <w:t>Nociones de camaras CCTV / IP, cableado y conexionado de sistemas de seguridad.</w:t>
       </w:r>
     </w:p>
     <w:p>
@@ -265,7 +243,16 @@
           <w:rFonts w:ascii="Calibri" w:hAnsi="Calibri"/>
           <w:sz w:val="21"/>
         </w:rPr>
-        <w:t>Soldadura, armado y diagnóstico de circuitos.</w:t>
+        <w:t>Interes y predisposicion para capacitarme en control de acceso y alarmas.</w:t>
+      </w:r>
+    </w:p>
+    <w:p>
+      <w:r>
+        <w:rPr>
+          <w:b/>
+          <w:sz w:val="21"/>
+        </w:rPr>
+        <w:t>Electronica</w:t>
       </w:r>
     </w:p>
     <w:p>
@@ -277,7 +264,7 @@
           <w:rFonts w:ascii="Calibri" w:hAnsi="Calibri"/>
           <w:sz w:val="21"/>
         </w:rPr>
-        <w:t>Redes básicas (TCP/IP, cableado, routers/switches).</w:t>
+        <w:t>Electronica analogica y digital; uso de instrumental (multimetro, osciloscopio, fuente).</w:t>
       </w:r>
     </w:p>
     <w:p>
@@ -289,7 +276,16 @@
           <w:rFonts w:ascii="Calibri" w:hAnsi="Calibri"/>
           <w:sz w:val="21"/>
         </w:rPr>
-        <w:t>Instalación y mantenimiento de PC, software y periféricos.</w:t>
+        <w:t>Soldadura, armado, medicion y diagnostico de circuitos y componentes.</w:t>
+      </w:r>
+    </w:p>
+    <w:p>
+      <w:r>
+        <w:rPr>
+          <w:b/>
+          <w:sz w:val="21"/>
+        </w:rPr>
+        <w:t>Informatica y redes</w:t>
       </w:r>
     </w:p>
     <w:p>
@@ -299,11 +295,21 @@
       <w:r>
         <w:rPr>
           <w:rFonts w:ascii="Calibri" w:hAnsi="Calibri"/>
-          <w:i/>
-          <w:color w:val="595959"/>
           <w:sz w:val="21"/>
         </w:rPr>
-        <w:t>[Agregá lo que realmente manejes: Arduino, fuentes, etc.]</w:t>
+        <w:t>Armado, mantenimiento y reparacion de PC; instalacion de software y perifericos.</w:t>
+      </w:r>
+    </w:p>
+    <w:p>
+      <w:pPr>
+        <w:pStyle w:val="ListBullet"/>
+      </w:pPr>
+      <w:r>
+        <w:rPr>
+          <w:rFonts w:ascii="Calibri" w:hAnsi="Calibri"/>
+          <w:sz w:val="21"/>
+        </w:rPr>
+        <w:t>Redes basicas (TCP/IP, cableado de red, configuracion de routers/switches).</w:t>
       </w:r>
     </w:p>
     <w:p>
@@ -327,9 +333,9 @@
         <w:rPr>
           <w:i/>
           <w:color w:val="595959"/>
-          <w:sz w:val="20"/>
+          <w:sz w:val="19"/>
         </w:rPr>
-        <w:t>Si nunca trabajaste en relación de dependencia, NO inventes empresas. Listá experiencia real aunque sea informal: changas, ayuda a familiares/vecinos, proyectos de la escuela. Esto cuenta y es honesto:</w:t>
+        <w:t>Completa cada punto con datos reales y borra los que no apliquen. (No agregues trabajos que no hiciste.)</w:t>
       </w:r>
     </w:p>
     <w:p>
@@ -343,7 +349,7 @@
           <w:color w:val="595959"/>
           <w:sz w:val="21"/>
         </w:rPr>
-        <w:t>Reparación / armado de PCs para conocidos y vecinos (changas). [Detallá qué hacías]</w:t>
+        <w:t>Proyecto final / trabajos practicos del Otto Krause: [nombre del proyecto y que hacia].</w:t>
       </w:r>
     </w:p>
     <w:p>
@@ -357,7 +363,7 @@
           <w:color w:val="595959"/>
           <w:sz w:val="21"/>
         </w:rPr>
-        <w:t>Proyecto final / trabajos prácticos del Otto Krause: [describí un proyecto de electrónica]</w:t>
+        <w:t>Armado y reparacion de PC para conocidos y vecinos: diagnostico, cambio de componentes, instalacion de sistema operativo. [ajustar]</w:t>
       </w:r>
     </w:p>
     <w:p>
@@ -371,21 +377,7 @@
           <w:color w:val="595959"/>
           <w:sz w:val="21"/>
         </w:rPr>
-        <w:t>Ayudante en [negocio familiar / tareas técnicas]: [qué tareas realizabas]</w:t>
-      </w:r>
-    </w:p>
-    <w:p>
-      <w:pPr>
-        <w:pStyle w:val="ListBullet"/>
-      </w:pPr>
-      <w:r>
-        <w:rPr>
-          <w:rFonts w:ascii="Calibri" w:hAnsi="Calibri"/>
-          <w:i/>
-          <w:color w:val="595959"/>
-          <w:sz w:val="21"/>
-        </w:rPr>
-        <w:t>Instalaciones o reparaciones hechas por tu cuenta (cámaras, redes hogareñas, etc.)</w:t>
+        <w:t>Instalaciones / reparaciones por cuenta propia (redes hogarenas, camaras, etc.): [detallar].</w:t>
       </w:r>
     </w:p>
     <w:p>
@@ -413,7 +405,7 @@
           <w:rFonts w:ascii="Calibri" w:hAnsi="Calibri"/>
           <w:sz w:val="21"/>
         </w:rPr>
-        <w:t>Gran disposición y entusiasmo por aprender cosas nuevas.</w:t>
+        <w:t>Gran predisposicion y entusiasmo por aprender cosas nuevas.</w:t>
       </w:r>
     </w:p>
     <w:p>
@@ -425,7 +417,7 @@
           <w:rFonts w:ascii="Calibri" w:hAnsi="Calibri"/>
           <w:sz w:val="21"/>
         </w:rPr>
-        <w:t>Responsabilidad y compromiso.</w:t>
+        <w:t>Responsabilidad, puntualidad y compromiso.</w:t>
       </w:r>
     </w:p>
     <w:p>
@@ -449,7 +441,33 @@
           <w:rFonts w:ascii="Calibri" w:hAnsi="Calibri"/>
           <w:sz w:val="21"/>
         </w:rPr>
-        <w:t>Resolución de problemas y atención al detalle.</w:t>
+        <w:t>Resolucion de problemas y atencion al detalle.</w:t>
+      </w:r>
+    </w:p>
+    <w:p>
+      <w:pPr>
+        <w:pBdr>
+          <w:bottom w:val="single" w:sz="6" w:space="2" w:color="1F4E79"/>
+        </w:pBdr>
+      </w:pPr>
+      <w:r>
+        <w:rPr>
+          <w:rFonts w:ascii="Calibri" w:hAnsi="Calibri"/>
+          <w:b/>
+          <w:color w:val="1F4E79"/>
+          <w:sz w:val="24"/>
+        </w:rPr>
+        <w:t>CURSOS (RECOMENDADOS PARA SUMAR VALOR RAPIDO)</w:t>
+      </w:r>
+    </w:p>
+    <w:p>
+      <w:r>
+        <w:rPr>
+          <w:i/>
+          <w:color w:val="595959"/>
+          <w:sz w:val="19"/>
+        </w:rPr>
+        <w:t>Cursos cortos y gratuitos. Hacelos y agregalos aca con la fecha real (suman mucho para este puesto):</w:t>
       </w:r>
     </w:p>
     <w:p>
@@ -459,9 +477,39 @@
       <w:r>
         <w:rPr>
           <w:rFonts w:ascii="Calibri" w:hAnsi="Calibri"/>
+          <w:i/>
+          <w:color w:val="595959"/>
           <w:sz w:val="21"/>
         </w:rPr>
-        <w:t>Disponibilidad para tareas de campo y movilidad en CABA.</w:t>
+        <w:t>CCTV / Videovigilancia IP — academias online de fabricantes (Hikvision, Dahua).</w:t>
+      </w:r>
+    </w:p>
+    <w:p>
+      <w:pPr>
+        <w:pStyle w:val="ListBullet"/>
+      </w:pPr>
+      <w:r>
+        <w:rPr>
+          <w:rFonts w:ascii="Calibri" w:hAnsi="Calibri"/>
+          <w:i/>
+          <w:color w:val="595959"/>
+          <w:sz w:val="21"/>
+        </w:rPr>
+        <w:t>Redes y cableado estructurado — Cisco “Networking Basics” (gratis).</w:t>
+      </w:r>
+    </w:p>
+    <w:p>
+      <w:pPr>
+        <w:pStyle w:val="ListBullet"/>
+      </w:pPr>
+      <w:r>
+        <w:rPr>
+          <w:rFonts w:ascii="Calibri" w:hAnsi="Calibri"/>
+          <w:i/>
+          <w:color w:val="595959"/>
+          <w:sz w:val="21"/>
+        </w:rPr>
+        <w:t>Introduccion a la ciberseguridad — Cisco / Fundacion Telefonica.</w:t>
       </w:r>
     </w:p>
     <w:p>
@@ -487,35 +535,14 @@
           <w:b/>
           <w:sz w:val="21"/>
         </w:rPr>
-        <w:t xml:space="preserve">Idiomas: </w:t>
+        <w:t xml:space="preserve">Disponibilidad: </w:t>
       </w:r>
       <w:r>
         <w:rPr>
           <w:rFonts w:ascii="Calibri" w:hAnsi="Calibri"/>
-          <w:i/>
-          <w:color w:val="595959"/>
           <w:sz w:val="21"/>
         </w:rPr>
-        <w:t>Español (nativo) — Inglés [nivel: básico/intermedio]</w:t>
-      </w:r>
-    </w:p>
-    <w:p>
-      <w:r>
-        <w:rPr>
-          <w:rFonts w:ascii="Calibri" w:hAnsi="Calibri"/>
-          <w:b/>
-          <w:sz w:val="21"/>
-        </w:rPr>
-        <w:t xml:space="preserve">Informática: </w:t>
-      </w:r>
-      <w:r>
-        <w:rPr>
-          <w:rFonts w:ascii="Calibri" w:hAnsi="Calibri"/>
-          <w:i/>
-          <w:color w:val="595959"/>
-          <w:sz w:val="21"/>
-        </w:rPr>
-        <w:t>Windows, paquete Office, [otros]</w:t>
+        <w:t>Horaria completa; el horario del puesto (8:30 a 14:30 h) no representa inconveniente.</w:t>
       </w:r>
     </w:p>
     <w:p>
@@ -534,7 +561,7 @@
           <w:color w:val="595959"/>
           <w:sz w:val="21"/>
         </w:rPr>
-        <w:t>[Licencia de conducir / SUBE / disponibilidad para viajar a clientes en CABA]</w:t>
+        <w:t>Disponibilidad para realizar trabajos en clientes dentro de CABA. [Indicar si tenes licencia de conducir]</w:t>
       </w:r>
     </w:p>
     <w:p>
@@ -544,7 +571,7 @@
           <w:b/>
           <w:sz w:val="21"/>
         </w:rPr>
-        <w:t xml:space="preserve">Disponibilidad: </w:t>
+        <w:t xml:space="preserve">Idiomas: </w:t>
       </w:r>
       <w:r>
         <w:rPr>
@@ -553,7 +580,7 @@
           <w:color w:val="595959"/>
           <w:sz w:val="21"/>
         </w:rPr>
-        <w:t>[Horaria — el puesto es de 8:30 a 14:30 h]</w:t>
+        <w:t>Espanol (nativo). Ingles: [nivel basico/intermedio — completar]</w:t>
       </w:r>
     </w:p>
     <w:p>
@@ -563,16 +590,14 @@
           <w:b/>
           <w:sz w:val="21"/>
         </w:rPr>
-        <w:t xml:space="preserve">Edad: </w:t>
+        <w:t xml:space="preserve">Informatica: </w:t>
       </w:r>
       <w:r>
         <w:rPr>
           <w:rFonts w:ascii="Calibri" w:hAnsi="Calibri"/>
-          <w:i/>
-          <w:color w:val="595959"/>
           <w:sz w:val="21"/>
         </w:rPr>
-        <w:t>24 años</w:t>
+        <w:t>Windows, paquete Office, diagnostico y mantenimiento de equipos.</w:t>
       </w:r>
     </w:p>
     <w:p/>
@@ -583,7 +608,7 @@
           <w:color w:val="B00000"/>
           <w:sz w:val="18"/>
         </w:rPr>
-        <w:t>——— NOTA (BORRAR ANTES DE ENVIAR): Reemplazá todo lo que está entre [corchetes] y en gris/itálica con tus datos reales. No agregues experiencia falsa. Una vez completo, guardalo como PDF para enviarlo.</w:t>
+        <w:t>--- NOTA (BORRAR ANTES DE ENVIAR): Solo falta completar lo que esta en gris/itálica y entre [corchetes] (nombre, contacto, barrio, ano de egreso, etc.). Guardalo como PDF para enviarlo. ---</w:t>
       </w:r>
     </w:p>
     <w:sectPr>

</xml_diff>